<commit_message>
S4: medir el coste del propio gobierno (D148)
IND-COS-12 a 14 en el 41 (horas de gobierno, coste sobre la inversión con
objetivos por intensidad y evidencias referenciadas); umbral Express, coste
por hora y objetivos en 13 §6; revisión en C5 (P37). T01 registra horas
declaradas por decisión y muestra el coste en la ficha; el conector (Python
y JS) y el motor del panel añaden la tarjeta «Coste del gobierno».
Sección 40 de la verificación.

Co-Authored-By: Claude Opus 5.5 <noreply@anthropic.com>
Claude-Session: https://claude.ai/code/session_014iYio6LvvzJ7Wvzr7BZcsM
</commit_message>
<xml_diff>
--- a/SEVEN-G/docx/en/plantillas/P37_SEVEN-G_Revision_anual_C5.docx
+++ b/SEVEN-G/docx/en/plantillas/P37_SEVEN-G_Revision_anual_C5.docx
@@ -80,7 +80,7 @@
               <w:pStyle w:val="Celda"/>
             </w:pPr>
             <w:r>
-              <w:t xml:space="preserve">0.1 (working draft)</w:t>
+              <w:t xml:space="preserve">0.2 (working draft)</w:t>
             </w:r>
           </w:p>
         </w:tc>
@@ -108,7 +108,7 @@
               <w:pStyle w:val="Celda"/>
             </w:pPr>
             <w:r>
-              <w:t xml:space="preserve">19-09-2026</w:t>
+              <w:t xml:space="preserve">01-10-2026</w:t>
             </w:r>
           </w:p>
         </w:tc>
@@ -3379,6 +3379,44 @@
           </w:p>
         </w:tc>
       </w:tr>
+      <w:tr>
+        <w:tc>
+          <w:tcPr>
+            <w:tcW w:w="3213" w:type="dxa"/>
+          </w:tcPr>
+          <w:p>
+            <w:pPr>
+              <w:pStyle w:val="Celda"/>
+            </w:pPr>
+            <w:r>
+              <w:t xml:space="preserve">Cost of governance by intensity (IND-COS-12 to 14)</w:t>
+            </w:r>
+          </w:p>
+        </w:tc>
+        <w:tc>
+          <w:tcPr>
+            <w:tcW w:w="3213" w:type="dxa"/>
+          </w:tcPr>
+          <w:p>
+            <w:pPr>
+              <w:pStyle w:val="Celda"/>
+            </w:pPr>
+          </w:p>
+        </w:tc>
+        <w:tc>
+          <w:tcPr>
+            <w:tcW w:w="3213" w:type="dxa"/>
+          </w:tcPr>
+          <w:p>
+            <w:pPr>
+              <w:pStyle w:val="Celda"/>
+            </w:pPr>
+            <w:r>
+              <w:t xml:space="preserve">Median hours and cost over investment by intensity against the C2 target (13 §6) and referenced evidence. If an intensity exceeds its target, the Express threshold, the reduced list (21 §2.5) or the evidence equivalences (21 §4.3) are reviewed; targets are recalibrated with the measured data.</w:t>
+            </w:r>
+          </w:p>
+        </w:tc>
+      </w:tr>
     </w:tbl>
     <w:p>
       <w:pPr>
@@ -9557,6 +9595,47 @@
             </w:pPr>
             <w:r>
               <w:t xml:space="preserve">First version. Covers the C5 outputs (01 §5.1) and the annual review in 13 §13: fulfilment of the thesis, maturity, index, funnel and cohorts (03 §3.5), consolidated lessons (14 §10.8; 43 §8.3), recalibration (12 §8), self-assessment of the bodies with an improvement plan (11, D1.11 and D1.12) and adjustments for the next C2.</w:t>
+            </w:r>
+          </w:p>
+        </w:tc>
+      </w:tr>
+      <w:tr>
+        <w:tc>
+          <w:tcPr>
+            <w:tcW w:w="3213" w:type="dxa"/>
+          </w:tcPr>
+          <w:p>
+            <w:pPr>
+              <w:pStyle w:val="Celda"/>
+            </w:pPr>
+            <w:r>
+              <w:t xml:space="preserve">0.2</w:t>
+            </w:r>
+          </w:p>
+        </w:tc>
+        <w:tc>
+          <w:tcPr>
+            <w:tcW w:w="3213" w:type="dxa"/>
+          </w:tcPr>
+          <w:p>
+            <w:pPr>
+              <w:pStyle w:val="Celda"/>
+            </w:pPr>
+            <w:r>
+              <w:t xml:space="preserve">01-10-2026</w:t>
+            </w:r>
+          </w:p>
+        </w:tc>
+        <w:tc>
+          <w:tcPr>
+            <w:tcW w:w="3213" w:type="dxa"/>
+          </w:tcPr>
+          <w:p>
+            <w:pPr>
+              <w:pStyle w:val="Celda"/>
+            </w:pPr>
+            <w:r>
+              <w:t xml:space="preserve">C5 review of the cost of governance by intensity against the proportionality targets (41 IND-COS-12 to 14).</w:t>
             </w:r>
           </w:p>
         </w:tc>

</xml_diff>